<commit_message>
Sync upstream proof bundle and add native MeTTa replay
Incorporate upstream Phase 1 fixes from 5d124b4, the regenerated
  library, documentation and exact-script proof bundle.

  Replay all 875 supplied witnesses through MeTTa and the independent
  Lean guard, preserving helper declarations and Duper profiles.
  Add fail-closed validation, checked resume receipts and per-goal
  qualification evidence. Use plain --lang petta in application commands.
</commit_message>
<xml_diff>
--- a/report/Phase1_Report_DRAFT.docx
+++ b/report/Phase1_Report_DRAFT.docx
@@ -12,7 +12,7 @@
     </w:p>
     <w:p>
       <w:r>
-        <w:t xml:space="preserve">Search · ATP (Vampire) · ITP (Lean 4) · LLM proposer, evaluated on the 999-theorem Megalodon reference library. September 2026.</w:t>
+        <w:t xml:space="preserve">Search · ATP (Vampire) · ITP (Lean 4) · LLM proposer, evaluated on the 999-theorem Megalodon reference library. October 2026.</w:t>
       </w:r>
     </w:p>
     <w:p>
@@ -34,10 +34,10 @@
         <w:rPr>
           <w:b/>
         </w:rPr>
-        <w:t xml:space="preserve">563 / 999 theorems (56.4%) proved with no LLM</w:t>
-      </w:r>
-      <w:r>
-        <w:t xml:space="preserve">, in a single run of the integrated pipeline, each theorem held out and proved only from facts that precede it in the library.</w:t>
+        <w:t xml:space="preserve">877 / 999 theorems (87.8%) proved</w:t>
+      </w:r>
+      <w:r>
+        <w:t xml:space="preserve">, each held out and proved only from facts that precede it in the library.</w:t>
       </w:r>
     </w:p>
     <w:p>
@@ -51,10 +51,19 @@
         <w:rPr>
           <w:b/>
         </w:rPr>
-        <w:t xml:space="preserve">584 / 999 (58.5%)</w:t>
-      </w:r>
-      <w:r>
-        <w:t xml:space="preserve"> when the 51 proofs found earlier by the LLM feedback loop are included.</w:t>
+        <w:t xml:space="preserve">665</w:t>
+      </w:r>
+      <w:r>
+        <w:t xml:space="preserve"> without any LLM (640 in the v4 pipeline run, 25 more from induction and earlier runs), and </w:t>
+      </w:r>
+      <w:r>
+        <w:rPr>
+          <w:b/>
+        </w:rPr>
+        <w:t xml:space="preserve">212</w:t>
+      </w:r>
+      <w:r>
+        <w:t xml:space="preserve"> by the LLM loop, all on theorems the pipeline had attempted and failed.</w:t>
       </w:r>
     </w:p>
     <w:p>
@@ -65,7 +74,7 @@
         </w:numPr>
       </w:pPr>
       <w:r>
-        <w:t xml:space="preserve">Every proof is checked by Lean 4's kernel, with the proof's statement compared to the original as elaborated terms and a leak guard rejecting any use of the target or later facts. All 563 no-LLM proofs were re-verified in fresh Lean processes: 563 / 563 passed.</w:t>
+        <w:t xml:space="preserve">Every proof is checked by Lean 4's kernel, with the proof's statement compared to the original as elaborated terms and a leak guard rejecting any use of the target or later facts. All 640 v4 proofs were re-verified in fresh Lean processes (640 / 640), and every LLM proof was re-verified from scratch (212 / 212).</w:t>
       </w:r>
     </w:p>
     <w:p>
@@ -76,7 +85,7 @@
         </w:numPr>
       </w:pPr>
       <w:r>
-        <w:t xml:space="preserve">Vampire and the LLM are untrusted proposers; only Lean decides.</w:t>
+        <w:t xml:space="preserve">Vampire and the LLM only propose proofs; every proof is verified by Lean.</w:t>
       </w:r>
     </w:p>
     <w:p>
@@ -87,7 +96,7 @@
         </w:numPr>
       </w:pPr>
       <w:r>
-        <w:t xml:space="preserve">The LLM informal-proof → formal-outline path is built and runs end to end. On a fixed sample of 32 of the hardest remaining theorems it proved 0 within a 100-call budget; Section 6.2 analyses why.</w:t>
+        <w:t xml:space="preserve">The decisive finding for the LLM: its failures were mostly about missing lemmas, not reasoning. Showing it 96 to 160 facts instead of 24 added about 100 proofs (Section 6.3).</w:t>
       </w:r>
     </w:p>
     <w:p>
@@ -98,7 +107,7 @@
         </w:numPr>
       </w:pPr>
       <w:r>
-        <w:t xml:space="preserve">Progression over three full runs: 418 → 514 → 563, through learned premise selection, automatic induction, strategies distilled from LLM proofs, using every proof Vampire finds, and a larger Vampire budget.</w:t>
+        <w:t xml:space="preserve">Progression: 418 → 514 → 563 → 640 without an LLM (v1–v4), then 742 → 755 → 832 → 859 → 877 with the LLM loop (v5–v9).</w:t>
       </w:r>
     </w:p>
     <w:p>
@@ -339,7 +348,7 @@
               <w:spacing w:after="0"/>
             </w:pPr>
             <w:r>
-              <w:t xml:space="preserve">LLM writes Lean tactic scripts; Lean's errors fed back for up to 3 rounds</w:t>
+              <w:t xml:space="preserve">LLM writes Lean tactic scripts; Lean's errors fed back for up to 7 rounds</w:t>
             </w:r>
           </w:p>
         </w:tc>
@@ -352,7 +361,7 @@
               <w:spacing w:after="0"/>
             </w:pPr>
             <w:r>
-              <w:t xml:space="preserve">Done, evaluated (Section 6)</w:t>
+              <w:t xml:space="preserve">Done: 212 theorems (Section 6)</w:t>
             </w:r>
           </w:p>
         </w:tc>
@@ -536,7 +545,7 @@
         <w:pStyle w:val="Code"/>
       </w:pPr>
       <w:r>
-        <w:t xml:space="preserve">goal ─► Search ─► earlier facts ─► Vampire (16–128 facts, 30 s)</w:t>
+        <w:t xml:space="preserve">goal ─► Search ─► earlier facts ─► Vampire (16–512 facts, 30 s)</w:t>
       </w:r>
     </w:p>
     <w:p>
@@ -584,7 +593,7 @@
         <w:pStyle w:val="Code"/>
       </w:pPr>
       <w:r>
-        <w:t xml:space="preserve">                   Lean tactic battery ◄────────────────┘</w:t>
+        <w:t xml:space="preserve">          Lean: battery → follow-ups → apply → Duper ◄──┘</w:t>
       </w:r>
     </w:p>
     <w:p>
@@ -616,7 +625,7 @@
         <w:pStyle w:val="Code"/>
       </w:pPr>
       <w:r>
-        <w:t xml:space="preserve">                   LLM proposes ─► Lean ─► error back to LLM</w:t>
+        <w:t xml:space="preserve">   LLM (Search's top 160 facts) proposes ─► Lean ─► error back to LLM</w:t>
       </w:r>
     </w:p>
     <w:p/>
@@ -938,7 +947,7 @@
         <w:t xml:space="preserve">eq</w:t>
       </w:r>
       <w:r>
-        <w:t xml:space="preserve">, …) map to native ones, and definitions are included transitively (depth 3). Vampire runs in portfolio mode for 30 s on the top 16, 32, 64 and 128 facts (v2 used 5 s on 16/32/64). Its proof is not reused directly: the facts it used become the premise hints for Lean. Vampire proofs are not unique, and the facts of one proof may suit Lean better than another's, so every distinct premise set is kept.</w:t>
+        <w:t xml:space="preserve">, …) map to native ones, and definitions are included transitively (depth 3). Vampire runs in portfolio mode for 30 s on the top 16, 32, 64, 128, 256 and 512 facts (v2 used 5 s on 16/32/64; v4 added 256 and 512). Its proof is not reused directly: the facts it used become the premise hints for Lean. Vampire proofs are not unique, and the facts of one proof may suit Lean better than another's, so every distinct premise set is kept.</w:t>
       </w:r>
     </w:p>
     <w:p>
@@ -1061,7 +1070,27 @@
         <w:t xml:space="preserve">simp_all</w:t>
       </w:r>
       <w:r>
-        <w:t xml:space="preserve"> with premises and definitions.</w:t>
+        <w:t xml:space="preserve"> with premises and definitions. v4 added a third line of </w:t>
+      </w:r>
+      <w:r>
+        <w:rPr>
+          <w:rFonts w:ascii="Consolas" w:hAnsi="Consolas"/>
+          <w:sz w:val="19"/>
+        </w:rPr>
+        <w:t xml:space="preserve">apply</w:t>
+      </w:r>
+      <w:r>
+        <w:t xml:space="preserve"> strategies and a fourth, Duper, a superposition prover running inside Lean that handles the higher-order instances </w:t>
+      </w:r>
+      <w:r>
+        <w:rPr>
+          <w:rFonts w:ascii="Consolas" w:hAnsi="Consolas"/>
+          <w:sz w:val="19"/>
+        </w:rPr>
+        <w:t xml:space="preserve">grind</w:t>
+      </w:r>
+      <w:r>
+        <w:t xml:space="preserve"> cannot.</w:t>
       </w:r>
     </w:p>
     <w:tbl>
@@ -1139,7 +1168,7 @@
               <w:spacing w:after="0"/>
             </w:pPr>
             <w:r>
-              <w:t xml:space="preserve">287</w:t>
+              <w:t xml:space="preserve">302</w:t>
             </w:r>
           </w:p>
         </w:tc>
@@ -1170,7 +1199,7 @@
               <w:spacing w:after="0"/>
             </w:pPr>
             <w:r>
-              <w:t xml:space="preserve">122</w:t>
+              <w:t xml:space="preserve">133</w:t>
             </w:r>
           </w:p>
         </w:tc>
@@ -1232,7 +1261,7 @@
               <w:spacing w:after="0"/>
             </w:pPr>
             <w:r>
-              <w:t xml:space="preserve">37</w:t>
+              <w:t xml:space="preserve">40</w:t>
             </w:r>
           </w:p>
         </w:tc>
@@ -1250,6 +1279,37 @@
               <w:spacing w:after="0"/>
             </w:pPr>
             <w:r>
+              <w:t xml:space="preserve">duper</w:t>
+            </w:r>
+          </w:p>
+        </w:tc>
+        <w:tc>
+          <w:tcPr>
+            <w:tcW w:w="2000" w:type="dxa"/>
+          </w:tcPr>
+          <w:p>
+            <w:pPr>
+              <w:spacing w:after="0"/>
+            </w:pPr>
+            <w:r>
+              <w:t xml:space="preserve">35</w:t>
+            </w:r>
+          </w:p>
+        </w:tc>
+      </w:tr>
+      <w:tr>
+        <w:trPr>
+          <w:cantSplit/>
+        </w:trPr>
+        <w:tc>
+          <w:tcPr>
+            <w:tcW w:w="4500" w:type="dxa"/>
+          </w:tcPr>
+          <w:p>
+            <w:pPr>
+              <w:spacing w:after="0"/>
+            </w:pPr>
+            <w:r>
               <w:t xml:space="preserve">intro-grind</w:t>
             </w:r>
           </w:p>
@@ -1294,7 +1354,7 @@
               <w:spacing w:after="0"/>
             </w:pPr>
             <w:r>
-              <w:t xml:space="preserve">15</w:t>
+              <w:t xml:space="preserve">14</w:t>
             </w:r>
           </w:p>
         </w:tc>
@@ -1312,6 +1372,37 @@
               <w:spacing w:after="0"/>
             </w:pPr>
             <w:r>
+              <w:t xml:space="preserve">duper-unfold</w:t>
+            </w:r>
+          </w:p>
+        </w:tc>
+        <w:tc>
+          <w:tcPr>
+            <w:tcW w:w="2000" w:type="dxa"/>
+          </w:tcPr>
+          <w:p>
+            <w:pPr>
+              <w:spacing w:after="0"/>
+            </w:pPr>
+            <w:r>
+              <w:t xml:space="preserve">9</w:t>
+            </w:r>
+          </w:p>
+        </w:tc>
+      </w:tr>
+      <w:tr>
+        <w:trPr>
+          <w:cantSplit/>
+        </w:trPr>
+        <w:tc>
+          <w:tcPr>
+            <w:tcW w:w="4500" w:type="dxa"/>
+          </w:tcPr>
+          <w:p>
+            <w:pPr>
+              <w:spacing w:after="0"/>
+            </w:pPr>
+            <w:r>
               <w:t xml:space="preserve">ext-grind</w:t>
             </w:r>
           </w:p>
@@ -1325,7 +1416,7 @@
               <w:spacing w:after="0"/>
             </w:pPr>
             <w:r>
-              <w:t xml:space="preserve">7</w:t>
+              <w:t xml:space="preserve">8</w:t>
             </w:r>
           </w:p>
         </w:tc>
@@ -1343,6 +1434,99 @@
               <w:spacing w:after="0"/>
             </w:pPr>
             <w:r>
+              <w:t xml:space="preserve">simp_all-prem</w:t>
+            </w:r>
+          </w:p>
+        </w:tc>
+        <w:tc>
+          <w:tcPr>
+            <w:tcW w:w="2000" w:type="dxa"/>
+          </w:tcPr>
+          <w:p>
+            <w:pPr>
+              <w:spacing w:after="0"/>
+            </w:pPr>
+            <w:r>
+              <w:t xml:space="preserve">3</w:t>
+            </w:r>
+          </w:p>
+        </w:tc>
+      </w:tr>
+      <w:tr>
+        <w:trPr>
+          <w:cantSplit/>
+        </w:trPr>
+        <w:tc>
+          <w:tcPr>
+            <w:tcW w:w="4500" w:type="dxa"/>
+          </w:tcPr>
+          <w:p>
+            <w:pPr>
+              <w:spacing w:after="0"/>
+            </w:pPr>
+            <w:r>
+              <w:t xml:space="preserve">apply-2</w:t>
+            </w:r>
+          </w:p>
+        </w:tc>
+        <w:tc>
+          <w:tcPr>
+            <w:tcW w:w="2000" w:type="dxa"/>
+          </w:tcPr>
+          <w:p>
+            <w:pPr>
+              <w:spacing w:after="0"/>
+            </w:pPr>
+            <w:r>
+              <w:t xml:space="preserve">2</w:t>
+            </w:r>
+          </w:p>
+        </w:tc>
+      </w:tr>
+      <w:tr>
+        <w:trPr>
+          <w:cantSplit/>
+        </w:trPr>
+        <w:tc>
+          <w:tcPr>
+            <w:tcW w:w="4500" w:type="dxa"/>
+          </w:tcPr>
+          <w:p>
+            <w:pPr>
+              <w:spacing w:after="0"/>
+            </w:pPr>
+            <w:r>
+              <w:t xml:space="preserve">goal-unfold-sbe</w:t>
+            </w:r>
+          </w:p>
+        </w:tc>
+        <w:tc>
+          <w:tcPr>
+            <w:tcW w:w="2000" w:type="dxa"/>
+          </w:tcPr>
+          <w:p>
+            <w:pPr>
+              <w:spacing w:after="0"/>
+            </w:pPr>
+            <w:r>
+              <w:t xml:space="preserve">2</w:t>
+            </w:r>
+          </w:p>
+        </w:tc>
+      </w:tr>
+      <w:tr>
+        <w:trPr>
+          <w:cantSplit/>
+        </w:trPr>
+        <w:tc>
+          <w:tcPr>
+            <w:tcW w:w="4500" w:type="dxa"/>
+          </w:tcPr>
+          <w:p>
+            <w:pPr>
+              <w:spacing w:after="0"/>
+            </w:pPr>
+            <w:r>
               <w:t xml:space="preserve">goal-unfold-grind</w:t>
             </w:r>
           </w:p>
@@ -1356,7 +1540,7 @@
               <w:spacing w:after="0"/>
             </w:pPr>
             <w:r>
-              <w:t xml:space="preserve">5</w:t>
+              <w:t xml:space="preserve">2</w:t>
             </w:r>
           </w:p>
         </w:tc>
@@ -1374,7 +1558,7 @@
               <w:spacing w:after="0"/>
             </w:pPr>
             <w:r>
-              <w:t xml:space="preserve">simp_all-prem</w:t>
+              <w:t xml:space="preserve">apply-0</w:t>
             </w:r>
           </w:p>
         </w:tc>
@@ -1387,7 +1571,7 @@
               <w:spacing w:after="0"/>
             </w:pPr>
             <w:r>
-              <w:t xml:space="preserve">3</w:t>
+              <w:t xml:space="preserve">2</w:t>
             </w:r>
           </w:p>
         </w:tc>
@@ -1405,7 +1589,7 @@
               <w:spacing w:after="0"/>
             </w:pPr>
             <w:r>
-              <w:t xml:space="preserve">goal-unfold-sbe</w:t>
+              <w:t xml:space="preserve">apply-1</w:t>
             </w:r>
           </w:p>
         </w:tc>
@@ -1437,6 +1621,37 @@
             </w:pPr>
             <w:r>
               <w:t xml:space="preserve">unfold-grind-big</w:t>
+            </w:r>
+          </w:p>
+        </w:tc>
+        <w:tc>
+          <w:tcPr>
+            <w:tcW w:w="2000" w:type="dxa"/>
+          </w:tcPr>
+          <w:p>
+            <w:pPr>
+              <w:spacing w:after="0"/>
+            </w:pPr>
+            <w:r>
+              <w:t xml:space="preserve">1</w:t>
+            </w:r>
+          </w:p>
+        </w:tc>
+      </w:tr>
+      <w:tr>
+        <w:trPr>
+          <w:cantSplit/>
+        </w:trPr>
+        <w:tc>
+          <w:tcPr>
+            <w:tcW w:w="4500" w:type="dxa"/>
+          </w:tcPr>
+          <w:p>
+            <w:pPr>
+              <w:spacing w:after="0"/>
+            </w:pPr>
+            <w:r>
+              <w:t xml:space="preserve">apply-unfold-3</w:t>
             </w:r>
           </w:p>
         </w:tc>
@@ -1512,7 +1727,7 @@
     </w:p>
     <w:p>
       <w:r>
-        <w:t xml:space="preserve">In the full run, induction proved 15 theorems (nat_ind 14, finite_ind 1), including commutativity of addition and of multiplication and associativity of addition on the naturals.</w:t>
+        <w:t xml:space="preserve">In the full run, induction proved 14 theorems (nat_ind 13, finite_ind 1), including commutativity of addition and of multiplication and associativity of addition on the naturals.</w:t>
       </w:r>
     </w:p>
     <w:p>
@@ -1691,10 +1906,54 @@
               <w:spacing w:after="0"/>
             </w:pPr>
             <w:r>
+              <w:t xml:space="preserve">v3: + Vampire 30 s with a 128-fact slice, second-line Lean strategies</w:t>
+            </w:r>
+          </w:p>
+        </w:tc>
+        <w:tc>
+          <w:tcPr>
+            <w:tcW w:w="1500" w:type="dxa"/>
+          </w:tcPr>
+          <w:p>
+            <w:pPr>
+              <w:spacing w:after="0"/>
+            </w:pPr>
+            <w:r>
+              <w:t xml:space="preserve">563</w:t>
+            </w:r>
+          </w:p>
+        </w:tc>
+        <w:tc>
+          <w:tcPr>
+            <w:tcW w:w="1500" w:type="dxa"/>
+          </w:tcPr>
+          <w:p>
+            <w:pPr>
+              <w:spacing w:after="0"/>
+            </w:pPr>
+            <w:r>
+              <w:t xml:space="preserve">56.4%</w:t>
+            </w:r>
+          </w:p>
+        </w:tc>
+      </w:tr>
+      <w:tr>
+        <w:trPr>
+          <w:cantSplit/>
+        </w:trPr>
+        <w:tc>
+          <w:tcPr>
+            <w:tcW w:w="6000" w:type="dxa"/>
+          </w:tcPr>
+          <w:p>
+            <w:pPr>
+              <w:spacing w:after="0"/>
+            </w:pPr>
+            <w:r>
               <w:rPr>
                 <w:b/>
               </w:rPr>
-              <w:t xml:space="preserve">v3: + Vampire 30 s with a 128-fact slice, second-line Lean strategies</w:t>
+              <w:t xml:space="preserve">v4: + Duper, 256/512-fact slices, `apply` strategies</w:t>
             </w:r>
           </w:p>
         </w:tc>
@@ -1710,7 +1969,7 @@
               <w:rPr>
                 <w:b/>
               </w:rPr>
-              <w:t xml:space="preserve">563</w:t>
+              <w:t xml:space="preserve">640</w:t>
             </w:r>
           </w:p>
         </w:tc>
@@ -1726,7 +1985,51 @@
               <w:rPr>
                 <w:b/>
               </w:rPr>
-              <w:t xml:space="preserve">56.4%</w:t>
+              <w:t xml:space="preserve">64.1%</w:t>
+            </w:r>
+          </w:p>
+        </w:tc>
+      </w:tr>
+      <w:tr>
+        <w:trPr>
+          <w:cantSplit/>
+        </w:trPr>
+        <w:tc>
+          <w:tcPr>
+            <w:tcW w:w="6000" w:type="dxa"/>
+          </w:tcPr>
+          <w:p>
+            <w:pPr>
+              <w:spacing w:after="0"/>
+            </w:pPr>
+            <w:r>
+              <w:t xml:space="preserve">v4 + induction and earlier runs (no LLM)</w:t>
+            </w:r>
+          </w:p>
+        </w:tc>
+        <w:tc>
+          <w:tcPr>
+            <w:tcW w:w="1500" w:type="dxa"/>
+          </w:tcPr>
+          <w:p>
+            <w:pPr>
+              <w:spacing w:after="0"/>
+            </w:pPr>
+            <w:r>
+              <w:t xml:space="preserve">665</w:t>
+            </w:r>
+          </w:p>
+        </w:tc>
+        <w:tc>
+          <w:tcPr>
+            <w:tcW w:w="1500" w:type="dxa"/>
+          </w:tcPr>
+          <w:p>
+            <w:pPr>
+              <w:spacing w:after="0"/>
+            </w:pPr>
+            <w:r>
+              <w:t xml:space="preserve">66.6%</w:t>
             </w:r>
           </w:p>
         </w:tc>
@@ -1739,10 +2042,11 @@
         <w:tblW w:w="0" w:type="auto"/>
       </w:tblPr>
       <w:tblGrid>
-        <w:gridCol w:w="2600"/>
-        <w:gridCol w:w="1300"/>
-        <w:gridCol w:w="1700"/>
-        <w:gridCol w:w="1700"/>
+        <w:gridCol w:w="2400"/>
+        <w:gridCol w:w="1200"/>
+        <w:gridCol w:w="1400"/>
+        <w:gridCol w:w="1400"/>
+        <w:gridCol w:w="1400"/>
         <w:gridCol w:w="1700"/>
       </w:tblGrid>
       <w:tr>
@@ -1752,7 +2056,7 @@
         </w:trPr>
         <w:tc>
           <w:tcPr>
-            <w:tcW w:w="2600" w:type="dxa"/>
+            <w:tcW w:w="2400" w:type="dxa"/>
             <w:shd w:val="clear" w:color="auto" w:fill="DCE3EF"/>
           </w:tcPr>
           <w:p>
@@ -1769,7 +2073,7 @@
         </w:tc>
         <w:tc>
           <w:tcPr>
-            <w:tcW w:w="1300" w:type="dxa"/>
+            <w:tcW w:w="1200" w:type="dxa"/>
             <w:shd w:val="clear" w:color="auto" w:fill="DCE3EF"/>
           </w:tcPr>
           <w:p>
@@ -1786,7 +2090,7 @@
         </w:tc>
         <w:tc>
           <w:tcPr>
-            <w:tcW w:w="1700" w:type="dxa"/>
+            <w:tcW w:w="1400" w:type="dxa"/>
             <w:shd w:val="clear" w:color="auto" w:fill="DCE3EF"/>
           </w:tcPr>
           <w:p>
@@ -1803,24 +2107,7 @@
         </w:tc>
         <w:tc>
           <w:tcPr>
-            <w:tcW w:w="1700" w:type="dxa"/>
-            <w:shd w:val="clear" w:color="auto" w:fill="DCE3EF"/>
-          </w:tcPr>
-          <w:p>
-            <w:pPr>
-              <w:spacing w:after="0"/>
-            </w:pPr>
-            <w:r>
-              <w:rPr>
-                <w:b/>
-              </w:rPr>
-              <w:t xml:space="preserve">v2</w:t>
-            </w:r>
-          </w:p>
-        </w:tc>
-        <w:tc>
-          <w:tcPr>
-            <w:tcW w:w="1700" w:type="dxa"/>
+            <w:tcW w:w="1400" w:type="dxa"/>
             <w:shd w:val="clear" w:color="auto" w:fill="DCE3EF"/>
           </w:tcPr>
           <w:p>
@@ -1835,14 +2122,48 @@
             </w:r>
           </w:p>
         </w:tc>
-      </w:tr>
-      <w:tr>
-        <w:trPr>
-          <w:cantSplit/>
-        </w:trPr>
-        <w:tc>
-          <w:tcPr>
-            <w:tcW w:w="2600" w:type="dxa"/>
+        <w:tc>
+          <w:tcPr>
+            <w:tcW w:w="1400" w:type="dxa"/>
+            <w:shd w:val="clear" w:color="auto" w:fill="DCE3EF"/>
+          </w:tcPr>
+          <w:p>
+            <w:pPr>
+              <w:spacing w:after="0"/>
+            </w:pPr>
+            <w:r>
+              <w:rPr>
+                <w:b/>
+              </w:rPr>
+              <w:t xml:space="preserve">v4</w:t>
+            </w:r>
+          </w:p>
+        </w:tc>
+        <w:tc>
+          <w:tcPr>
+            <w:tcW w:w="1700" w:type="dxa"/>
+            <w:shd w:val="clear" w:color="auto" w:fill="DCE3EF"/>
+          </w:tcPr>
+          <w:p>
+            <w:pPr>
+              <w:spacing w:after="0"/>
+            </w:pPr>
+            <w:r>
+              <w:rPr>
+                <w:b/>
+              </w:rPr>
+              <w:t xml:space="preserve">Final (with LLM)</w:t>
+            </w:r>
+          </w:p>
+        </w:tc>
+      </w:tr>
+      <w:tr>
+        <w:trPr>
+          <w:cantSplit/>
+        </w:trPr>
+        <w:tc>
+          <w:tcPr>
+            <w:tcW w:w="2400" w:type="dxa"/>
           </w:tcPr>
           <w:p>
             <w:pPr>
@@ -1855,7 +2176,7 @@
         </w:tc>
         <w:tc>
           <w:tcPr>
-            <w:tcW w:w="1300" w:type="dxa"/>
+            <w:tcW w:w="1200" w:type="dxa"/>
           </w:tcPr>
           <w:p>
             <w:pPr>
@@ -1868,6 +2189,45 @@
         </w:tc>
         <w:tc>
           <w:tcPr>
+            <w:tcW w:w="1400" w:type="dxa"/>
+          </w:tcPr>
+          <w:p>
+            <w:pPr>
+              <w:spacing w:after="0"/>
+            </w:pPr>
+            <w:r>
+              <w:t xml:space="preserve">36 (92%)</w:t>
+            </w:r>
+          </w:p>
+        </w:tc>
+        <w:tc>
+          <w:tcPr>
+            <w:tcW w:w="1400" w:type="dxa"/>
+          </w:tcPr>
+          <w:p>
+            <w:pPr>
+              <w:spacing w:after="0"/>
+            </w:pPr>
+            <w:r>
+              <w:t xml:space="preserve">38 (97%)</w:t>
+            </w:r>
+          </w:p>
+        </w:tc>
+        <w:tc>
+          <w:tcPr>
+            <w:tcW w:w="1400" w:type="dxa"/>
+          </w:tcPr>
+          <w:p>
+            <w:pPr>
+              <w:spacing w:after="0"/>
+            </w:pPr>
+            <w:r>
+              <w:t xml:space="preserve">38 (97%)</w:t>
+            </w:r>
+          </w:p>
+        </w:tc>
+        <w:tc>
+          <w:tcPr>
             <w:tcW w:w="1700" w:type="dxa"/>
           </w:tcPr>
           <w:p>
@@ -1875,7 +2235,77 @@
               <w:spacing w:after="0"/>
             </w:pPr>
             <w:r>
-              <w:t xml:space="preserve">36 (92%)</w:t>
+              <w:t xml:space="preserve">39 (100%)</w:t>
+            </w:r>
+          </w:p>
+        </w:tc>
+      </w:tr>
+      <w:tr>
+        <w:trPr>
+          <w:cantSplit/>
+        </w:trPr>
+        <w:tc>
+          <w:tcPr>
+            <w:tcW w:w="2400" w:type="dxa"/>
+          </w:tcPr>
+          <w:p>
+            <w:pPr>
+              <w:spacing w:after="0"/>
+            </w:pPr>
+            <w:r>
+              <w:t xml:space="preserve">Set theory</w:t>
+            </w:r>
+          </w:p>
+        </w:tc>
+        <w:tc>
+          <w:tcPr>
+            <w:tcW w:w="1200" w:type="dxa"/>
+          </w:tcPr>
+          <w:p>
+            <w:pPr>
+              <w:spacing w:after="0"/>
+            </w:pPr>
+            <w:r>
+              <w:t xml:space="preserve">179</w:t>
+            </w:r>
+          </w:p>
+        </w:tc>
+        <w:tc>
+          <w:tcPr>
+            <w:tcW w:w="1400" w:type="dxa"/>
+          </w:tcPr>
+          <w:p>
+            <w:pPr>
+              <w:spacing w:after="0"/>
+            </w:pPr>
+            <w:r>
+              <w:t xml:space="preserve">96 (54%)</w:t>
+            </w:r>
+          </w:p>
+        </w:tc>
+        <w:tc>
+          <w:tcPr>
+            <w:tcW w:w="1400" w:type="dxa"/>
+          </w:tcPr>
+          <w:p>
+            <w:pPr>
+              <w:spacing w:after="0"/>
+            </w:pPr>
+            <w:r>
+              <w:t xml:space="preserve">123 (69%)</w:t>
+            </w:r>
+          </w:p>
+        </w:tc>
+        <w:tc>
+          <w:tcPr>
+            <w:tcW w:w="1400" w:type="dxa"/>
+          </w:tcPr>
+          <w:p>
+            <w:pPr>
+              <w:spacing w:after="0"/>
+            </w:pPr>
+            <w:r>
+              <w:t xml:space="preserve">133 (74%)</w:t>
             </w:r>
           </w:p>
         </w:tc>
@@ -1888,7 +2318,77 @@
               <w:spacing w:after="0"/>
             </w:pPr>
             <w:r>
-              <w:t xml:space="preserve">37 (95%)</w:t>
+              <w:t xml:space="preserve">177 (99%)</w:t>
+            </w:r>
+          </w:p>
+        </w:tc>
+      </w:tr>
+      <w:tr>
+        <w:trPr>
+          <w:cantSplit/>
+        </w:trPr>
+        <w:tc>
+          <w:tcPr>
+            <w:tcW w:w="2400" w:type="dxa"/>
+          </w:tcPr>
+          <w:p>
+            <w:pPr>
+              <w:spacing w:after="0"/>
+            </w:pPr>
+            <w:r>
+              <w:t xml:space="preserve">Natural numbers</w:t>
+            </w:r>
+          </w:p>
+        </w:tc>
+        <w:tc>
+          <w:tcPr>
+            <w:tcW w:w="1200" w:type="dxa"/>
+          </w:tcPr>
+          <w:p>
+            <w:pPr>
+              <w:spacing w:after="0"/>
+            </w:pPr>
+            <w:r>
+              <w:t xml:space="preserve">119</w:t>
+            </w:r>
+          </w:p>
+        </w:tc>
+        <w:tc>
+          <w:tcPr>
+            <w:tcW w:w="1400" w:type="dxa"/>
+          </w:tcPr>
+          <w:p>
+            <w:pPr>
+              <w:spacing w:after="0"/>
+            </w:pPr>
+            <w:r>
+              <w:t xml:space="preserve">48 (40%)</w:t>
+            </w:r>
+          </w:p>
+        </w:tc>
+        <w:tc>
+          <w:tcPr>
+            <w:tcW w:w="1400" w:type="dxa"/>
+          </w:tcPr>
+          <w:p>
+            <w:pPr>
+              <w:spacing w:after="0"/>
+            </w:pPr>
+            <w:r>
+              <w:t xml:space="preserve">81 (68%)</w:t>
+            </w:r>
+          </w:p>
+        </w:tc>
+        <w:tc>
+          <w:tcPr>
+            <w:tcW w:w="1400" w:type="dxa"/>
+          </w:tcPr>
+          <w:p>
+            <w:pPr>
+              <w:spacing w:after="0"/>
+            </w:pPr>
+            <w:r>
+              <w:t xml:space="preserve">87 (73%)</w:t>
             </w:r>
           </w:p>
         </w:tc>
@@ -1901,38 +2401,77 @@
               <w:spacing w:after="0"/>
             </w:pPr>
             <w:r>
-              <w:t xml:space="preserve">38 (97%)</w:t>
-            </w:r>
-          </w:p>
-        </w:tc>
-      </w:tr>
-      <w:tr>
-        <w:trPr>
-          <w:cantSplit/>
-        </w:trPr>
-        <w:tc>
-          <w:tcPr>
-            <w:tcW w:w="2600" w:type="dxa"/>
-          </w:tcPr>
-          <w:p>
-            <w:pPr>
-              <w:spacing w:after="0"/>
-            </w:pPr>
-            <w:r>
-              <w:t xml:space="preserve">Set theory</w:t>
-            </w:r>
-          </w:p>
-        </w:tc>
-        <w:tc>
-          <w:tcPr>
-            <w:tcW w:w="1300" w:type="dxa"/>
-          </w:tcPr>
-          <w:p>
-            <w:pPr>
-              <w:spacing w:after="0"/>
-            </w:pPr>
-            <w:r>
-              <w:t xml:space="preserve">179</w:t>
+              <w:t xml:space="preserve">115 (97%)</w:t>
+            </w:r>
+          </w:p>
+        </w:tc>
+      </w:tr>
+      <w:tr>
+        <w:trPr>
+          <w:cantSplit/>
+        </w:trPr>
+        <w:tc>
+          <w:tcPr>
+            <w:tcW w:w="2400" w:type="dxa"/>
+          </w:tcPr>
+          <w:p>
+            <w:pPr>
+              <w:spacing w:after="0"/>
+            </w:pPr>
+            <w:r>
+              <w:t xml:space="preserve">Ordinals</w:t>
+            </w:r>
+          </w:p>
+        </w:tc>
+        <w:tc>
+          <w:tcPr>
+            <w:tcW w:w="1200" w:type="dxa"/>
+          </w:tcPr>
+          <w:p>
+            <w:pPr>
+              <w:spacing w:after="0"/>
+            </w:pPr>
+            <w:r>
+              <w:t xml:space="preserve">56</w:t>
+            </w:r>
+          </w:p>
+        </w:tc>
+        <w:tc>
+          <w:tcPr>
+            <w:tcW w:w="1400" w:type="dxa"/>
+          </w:tcPr>
+          <w:p>
+            <w:pPr>
+              <w:spacing w:after="0"/>
+            </w:pPr>
+            <w:r>
+              <w:t xml:space="preserve">31 (55%)</w:t>
+            </w:r>
+          </w:p>
+        </w:tc>
+        <w:tc>
+          <w:tcPr>
+            <w:tcW w:w="1400" w:type="dxa"/>
+          </w:tcPr>
+          <w:p>
+            <w:pPr>
+              <w:spacing w:after="0"/>
+            </w:pPr>
+            <w:r>
+              <w:t xml:space="preserve">37 (66%)</w:t>
+            </w:r>
+          </w:p>
+        </w:tc>
+        <w:tc>
+          <w:tcPr>
+            <w:tcW w:w="1400" w:type="dxa"/>
+          </w:tcPr>
+          <w:p>
+            <w:pPr>
+              <w:spacing w:after="0"/>
+            </w:pPr>
+            <w:r>
+              <w:t xml:space="preserve">39 (70%)</w:t>
             </w:r>
           </w:p>
         </w:tc>
@@ -1945,7 +2484,77 @@
               <w:spacing w:after="0"/>
             </w:pPr>
             <w:r>
-              <w:t xml:space="preserve">96 (54%)</w:t>
+              <w:t xml:space="preserve">51 (91%)</w:t>
+            </w:r>
+          </w:p>
+        </w:tc>
+      </w:tr>
+      <w:tr>
+        <w:trPr>
+          <w:cantSplit/>
+        </w:trPr>
+        <w:tc>
+          <w:tcPr>
+            <w:tcW w:w="2400" w:type="dxa"/>
+          </w:tcPr>
+          <w:p>
+            <w:pPr>
+              <w:spacing w:after="0"/>
+            </w:pPr>
+            <w:r>
+              <w:t xml:space="preserve">Surreal numbers</w:t>
+            </w:r>
+          </w:p>
+        </w:tc>
+        <w:tc>
+          <w:tcPr>
+            <w:tcW w:w="1200" w:type="dxa"/>
+          </w:tcPr>
+          <w:p>
+            <w:pPr>
+              <w:spacing w:after="0"/>
+            </w:pPr>
+            <w:r>
+              <w:t xml:space="preserve">606</w:t>
+            </w:r>
+          </w:p>
+        </w:tc>
+        <w:tc>
+          <w:tcPr>
+            <w:tcW w:w="1400" w:type="dxa"/>
+          </w:tcPr>
+          <w:p>
+            <w:pPr>
+              <w:spacing w:after="0"/>
+            </w:pPr>
+            <w:r>
+              <w:t xml:space="preserve">207 (34%)</w:t>
+            </w:r>
+          </w:p>
+        </w:tc>
+        <w:tc>
+          <w:tcPr>
+            <w:tcW w:w="1400" w:type="dxa"/>
+          </w:tcPr>
+          <w:p>
+            <w:pPr>
+              <w:spacing w:after="0"/>
+            </w:pPr>
+            <w:r>
+              <w:t xml:space="preserve">284 (47%)</w:t>
+            </w:r>
+          </w:p>
+        </w:tc>
+        <w:tc>
+          <w:tcPr>
+            <w:tcW w:w="1400" w:type="dxa"/>
+          </w:tcPr>
+          <w:p>
+            <w:pPr>
+              <w:spacing w:after="0"/>
+            </w:pPr>
+            <w:r>
+              <w:t xml:space="preserve">343 (57%)</w:t>
             </w:r>
           </w:p>
         </w:tc>
@@ -1958,230 +2567,7 @@
               <w:spacing w:after="0"/>
             </w:pPr>
             <w:r>
-              <w:t xml:space="preserve">115 (64%)</w:t>
-            </w:r>
-          </w:p>
-        </w:tc>
-        <w:tc>
-          <w:tcPr>
-            <w:tcW w:w="1700" w:type="dxa"/>
-          </w:tcPr>
-          <w:p>
-            <w:pPr>
-              <w:spacing w:after="0"/>
-            </w:pPr>
-            <w:r>
-              <w:t xml:space="preserve">123 (69%)</w:t>
-            </w:r>
-          </w:p>
-        </w:tc>
-      </w:tr>
-      <w:tr>
-        <w:trPr>
-          <w:cantSplit/>
-        </w:trPr>
-        <w:tc>
-          <w:tcPr>
-            <w:tcW w:w="2600" w:type="dxa"/>
-          </w:tcPr>
-          <w:p>
-            <w:pPr>
-              <w:spacing w:after="0"/>
-            </w:pPr>
-            <w:r>
-              <w:t xml:space="preserve">Natural numbers</w:t>
-            </w:r>
-          </w:p>
-        </w:tc>
-        <w:tc>
-          <w:tcPr>
-            <w:tcW w:w="1300" w:type="dxa"/>
-          </w:tcPr>
-          <w:p>
-            <w:pPr>
-              <w:spacing w:after="0"/>
-            </w:pPr>
-            <w:r>
-              <w:t xml:space="preserve">119</w:t>
-            </w:r>
-          </w:p>
-        </w:tc>
-        <w:tc>
-          <w:tcPr>
-            <w:tcW w:w="1700" w:type="dxa"/>
-          </w:tcPr>
-          <w:p>
-            <w:pPr>
-              <w:spacing w:after="0"/>
-            </w:pPr>
-            <w:r>
-              <w:t xml:space="preserve">48 (40%)</w:t>
-            </w:r>
-          </w:p>
-        </w:tc>
-        <w:tc>
-          <w:tcPr>
-            <w:tcW w:w="1700" w:type="dxa"/>
-          </w:tcPr>
-          <w:p>
-            <w:pPr>
-              <w:spacing w:after="0"/>
-            </w:pPr>
-            <w:r>
-              <w:t xml:space="preserve">72 (61%)</w:t>
-            </w:r>
-          </w:p>
-        </w:tc>
-        <w:tc>
-          <w:tcPr>
-            <w:tcW w:w="1700" w:type="dxa"/>
-          </w:tcPr>
-          <w:p>
-            <w:pPr>
-              <w:spacing w:after="0"/>
-            </w:pPr>
-            <w:r>
-              <w:t xml:space="preserve">81 (68%)</w:t>
-            </w:r>
-          </w:p>
-        </w:tc>
-      </w:tr>
-      <w:tr>
-        <w:trPr>
-          <w:cantSplit/>
-        </w:trPr>
-        <w:tc>
-          <w:tcPr>
-            <w:tcW w:w="2600" w:type="dxa"/>
-          </w:tcPr>
-          <w:p>
-            <w:pPr>
-              <w:spacing w:after="0"/>
-            </w:pPr>
-            <w:r>
-              <w:t xml:space="preserve">Ordinals</w:t>
-            </w:r>
-          </w:p>
-        </w:tc>
-        <w:tc>
-          <w:tcPr>
-            <w:tcW w:w="1300" w:type="dxa"/>
-          </w:tcPr>
-          <w:p>
-            <w:pPr>
-              <w:spacing w:after="0"/>
-            </w:pPr>
-            <w:r>
-              <w:t xml:space="preserve">56</w:t>
-            </w:r>
-          </w:p>
-        </w:tc>
-        <w:tc>
-          <w:tcPr>
-            <w:tcW w:w="1700" w:type="dxa"/>
-          </w:tcPr>
-          <w:p>
-            <w:pPr>
-              <w:spacing w:after="0"/>
-            </w:pPr>
-            <w:r>
-              <w:t xml:space="preserve">31 (55%)</w:t>
-            </w:r>
-          </w:p>
-        </w:tc>
-        <w:tc>
-          <w:tcPr>
-            <w:tcW w:w="1700" w:type="dxa"/>
-          </w:tcPr>
-          <w:p>
-            <w:pPr>
-              <w:spacing w:after="0"/>
-            </w:pPr>
-            <w:r>
-              <w:t xml:space="preserve">34 (61%)</w:t>
-            </w:r>
-          </w:p>
-        </w:tc>
-        <w:tc>
-          <w:tcPr>
-            <w:tcW w:w="1700" w:type="dxa"/>
-          </w:tcPr>
-          <w:p>
-            <w:pPr>
-              <w:spacing w:after="0"/>
-            </w:pPr>
-            <w:r>
-              <w:t xml:space="preserve">37 (66%)</w:t>
-            </w:r>
-          </w:p>
-        </w:tc>
-      </w:tr>
-      <w:tr>
-        <w:trPr>
-          <w:cantSplit/>
-        </w:trPr>
-        <w:tc>
-          <w:tcPr>
-            <w:tcW w:w="2600" w:type="dxa"/>
-          </w:tcPr>
-          <w:p>
-            <w:pPr>
-              <w:spacing w:after="0"/>
-            </w:pPr>
-            <w:r>
-              <w:t xml:space="preserve">Surreal numbers</w:t>
-            </w:r>
-          </w:p>
-        </w:tc>
-        <w:tc>
-          <w:tcPr>
-            <w:tcW w:w="1300" w:type="dxa"/>
-          </w:tcPr>
-          <w:p>
-            <w:pPr>
-              <w:spacing w:after="0"/>
-            </w:pPr>
-            <w:r>
-              <w:t xml:space="preserve">606</w:t>
-            </w:r>
-          </w:p>
-        </w:tc>
-        <w:tc>
-          <w:tcPr>
-            <w:tcW w:w="1700" w:type="dxa"/>
-          </w:tcPr>
-          <w:p>
-            <w:pPr>
-              <w:spacing w:after="0"/>
-            </w:pPr>
-            <w:r>
-              <w:t xml:space="preserve">207 (34%)</w:t>
-            </w:r>
-          </w:p>
-        </w:tc>
-        <w:tc>
-          <w:tcPr>
-            <w:tcW w:w="1700" w:type="dxa"/>
-          </w:tcPr>
-          <w:p>
-            <w:pPr>
-              <w:spacing w:after="0"/>
-            </w:pPr>
-            <w:r>
-              <w:t xml:space="preserve">256 (42%)</w:t>
-            </w:r>
-          </w:p>
-        </w:tc>
-        <w:tc>
-          <w:tcPr>
-            <w:tcW w:w="1700" w:type="dxa"/>
-          </w:tcPr>
-          <w:p>
-            <w:pPr>
-              <w:spacing w:after="0"/>
-            </w:pPr>
-            <w:r>
-              <w:t xml:space="preserve">284 (47%)</w:t>
+              <w:t xml:space="preserve">495 (82%)</w:t>
             </w:r>
           </w:p>
         </w:tc>
@@ -2198,12 +2584,12 @@
     </w:p>
     <w:p>
       <w:r>
-        <w:t xml:space="preserve">v2 against v1: 113 theorems gained, 17 lost. v3 against v2: 57 gained, 8 lost. The losses are borderline goals where Vampire found a different proof, or none within its time limit; the pipeline has run-to-run variation on such goals.</w:t>
-      </w:r>
-    </w:p>
-    <w:p>
-      <w:r>
-        <w:t xml:space="preserve">Unproved: 436. For 115 of them Vampire found a proof that the Lean battery could not rebuild; for 321 Vampire found none.</w:t>
+        <w:t xml:space="preserve">v2 against v1: 113 theorems gained, 17 lost. v3 against v2: 57 gained, 8 lost; v4 against v3: 82 gained, 5 lost. The losses are borderline goals where Vampire found a different proof, or none within its time limit; the pipeline has run-to-run variation on such goals.</w:t>
+      </w:r>
+    </w:p>
+    <w:p>
+      <w:r>
+        <w:t xml:space="preserve">Unproved by v4: 359. For 59 of them Vampire found a proof that the Lean battery could not rebuild; for 300 Vampire found none.</w:t>
       </w:r>
     </w:p>
     <w:p>
@@ -2250,7 +2636,7 @@
         <w:t xml:space="preserve">Time per goal</w:t>
       </w:r>
       <w:r>
-        <w:t xml:space="preserve"> (one goal at a time, as in use): in v3, proved goals take a median of 42 s, 90% within 157 s; unproved goals are abandoned after a median of 190 s. The larger Vampire budget is the price of v3's gain (v2: 25 s and 85 s).</w:t>
+        <w:t xml:space="preserve"> (one goal at a time, as in use): in v4, proved goals take a median of 60 s, 90% within 266 s; unproved goals are abandoned after a median of 265 s.</w:t>
       </w:r>
     </w:p>
     <w:p>
@@ -2258,7 +2644,7 @@
         <w:pStyle w:val="Heading1"/>
       </w:pPr>
       <w:r>
-        <w:t xml:space="preserve">6. LLM as an untrusted proposer</w:t>
+        <w:t xml:space="preserve">6. The LLM loop</w:t>
       </w:r>
     </w:p>
     <w:p>
@@ -2271,7 +2657,7 @@
         <w:pStyle w:val="Heading2"/>
       </w:pPr>
       <w:r>
-        <w:t xml:space="preserve">6.1 Direct Lean with error feedback (v1)</w:t>
+        <w:t xml:space="preserve">6.1 First evaluation: direct Lean with error feedback (v1)</w:t>
       </w:r>
     </w:p>
     <w:p>
@@ -2543,7 +2929,7 @@
         <w:pStyle w:val="Heading2"/>
       </w:pPr>
       <w:r>
-        <w:t xml:space="preserve">6.2 Draft, sketch, prove</w:t>
+        <w:t xml:space="preserve">6.2 Draft, sketch, prove (v3)</w:t>
       </w:r>
     </w:p>
     <w:p>
@@ -2940,6 +3326,497 @@
     </w:p>
     <w:p>
       <w:pPr>
+        <w:pStyle w:val="Heading2"/>
+      </w:pPr>
+      <w:r>
+        <w:t xml:space="preserve">6.3 The fixed LLM loop (v5–v9)</w:t>
+      </w:r>
+    </w:p>
+    <w:p>
+      <w:r>
+        <w:t xml:space="preserve">From v5 the LLM loop runs over every theorem the pipeline leaves unproved: up to 7 rounds per theorem, each round a Lean check whose error goes back to the model. Model: deepseek/deepseek-v4-flash, served through the SingularityNET gateway.</w:t>
+      </w:r>
+    </w:p>
+    <w:tbl>
+      <w:tblPr>
+        <w:tblStyle w:val="Grid"/>
+        <w:tblW w:w="0" w:type="auto"/>
+      </w:tblPr>
+      <w:tblGrid>
+        <w:gridCol w:w="1200"/>
+        <w:gridCol w:w="5300"/>
+        <w:gridCol w:w="1300"/>
+        <w:gridCol w:w="1200"/>
+      </w:tblGrid>
+      <w:tr>
+        <w:trPr>
+          <w:cantSplit/>
+          <w:tblHeader/>
+        </w:trPr>
+        <w:tc>
+          <w:tcPr>
+            <w:tcW w:w="1200" w:type="dxa"/>
+            <w:shd w:val="clear" w:color="auto" w:fill="DCE3EF"/>
+          </w:tcPr>
+          <w:p>
+            <w:pPr>
+              <w:spacing w:after="0"/>
+            </w:pPr>
+            <w:r>
+              <w:rPr>
+                <w:b/>
+              </w:rPr>
+              <w:t xml:space="preserve">Version</w:t>
+            </w:r>
+          </w:p>
+        </w:tc>
+        <w:tc>
+          <w:tcPr>
+            <w:tcW w:w="5300" w:type="dxa"/>
+            <w:shd w:val="clear" w:color="auto" w:fill="DCE3EF"/>
+          </w:tcPr>
+          <w:p>
+            <w:pPr>
+              <w:spacing w:after="0"/>
+            </w:pPr>
+            <w:r>
+              <w:rPr>
+                <w:b/>
+              </w:rPr>
+              <w:t xml:space="preserve">What changed</w:t>
+            </w:r>
+          </w:p>
+        </w:tc>
+        <w:tc>
+          <w:tcPr>
+            <w:tcW w:w="1300" w:type="dxa"/>
+            <w:shd w:val="clear" w:color="auto" w:fill="DCE3EF"/>
+          </w:tcPr>
+          <w:p>
+            <w:pPr>
+              <w:spacing w:after="0"/>
+            </w:pPr>
+            <w:r>
+              <w:rPr>
+                <w:b/>
+              </w:rPr>
+              <w:t xml:space="preserve">Proved</w:t>
+            </w:r>
+          </w:p>
+        </w:tc>
+        <w:tc>
+          <w:tcPr>
+            <w:tcW w:w="1200" w:type="dxa"/>
+            <w:shd w:val="clear" w:color="auto" w:fill="DCE3EF"/>
+          </w:tcPr>
+          <w:p>
+            <w:pPr>
+              <w:spacing w:after="0"/>
+            </w:pPr>
+            <w:r>
+              <w:rPr>
+                <w:b/>
+              </w:rPr>
+              <w:t xml:space="preserve">Gain</w:t>
+            </w:r>
+          </w:p>
+        </w:tc>
+      </w:tr>
+      <w:tr>
+        <w:trPr>
+          <w:cantSplit/>
+        </w:trPr>
+        <w:tc>
+          <w:tcPr>
+            <w:tcW w:w="1200" w:type="dxa"/>
+          </w:tcPr>
+          <w:p>
+            <w:pPr>
+              <w:spacing w:after="0"/>
+            </w:pPr>
+            <w:r>
+              <w:t xml:space="preserve">v4 + earlier</w:t>
+            </w:r>
+          </w:p>
+        </w:tc>
+        <w:tc>
+          <w:tcPr>
+            <w:tcW w:w="5300" w:type="dxa"/>
+          </w:tcPr>
+          <w:p>
+            <w:pPr>
+              <w:spacing w:after="0"/>
+            </w:pPr>
+            <w:r>
+              <w:t xml:space="preserve">No LLM</w:t>
+            </w:r>
+          </w:p>
+        </w:tc>
+        <w:tc>
+          <w:tcPr>
+            <w:tcW w:w="1300" w:type="dxa"/>
+          </w:tcPr>
+          <w:p>
+            <w:pPr>
+              <w:spacing w:after="0"/>
+            </w:pPr>
+            <w:r>
+              <w:t xml:space="preserve">665</w:t>
+            </w:r>
+          </w:p>
+        </w:tc>
+        <w:tc>
+          <w:tcPr>
+            <w:tcW w:w="1200" w:type="dxa"/>
+          </w:tcPr>
+          <w:p>
+            <w:pPr>
+              <w:spacing w:after="0"/>
+            </w:pPr>
+            <w:r>
+              <w:t xml:space="preserve">—</w:t>
+            </w:r>
+          </w:p>
+        </w:tc>
+      </w:tr>
+      <w:tr>
+        <w:trPr>
+          <w:cantSplit/>
+        </w:trPr>
+        <w:tc>
+          <w:tcPr>
+            <w:tcW w:w="1200" w:type="dxa"/>
+          </w:tcPr>
+          <w:p>
+            <w:pPr>
+              <w:spacing w:after="0"/>
+            </w:pPr>
+            <w:r>
+              <w:t xml:space="preserve">v5</w:t>
+            </w:r>
+          </w:p>
+        </w:tc>
+        <w:tc>
+          <w:tcPr>
+            <w:tcW w:w="5300" w:type="dxa"/>
+          </w:tcPr>
+          <w:p>
+            <w:pPr>
+              <w:spacing w:after="0"/>
+            </w:pPr>
+            <w:r>
+              <w:t xml:space="preserve">Hidden failures fixed (73% of replies were empty: the model used the gateway's 8,192-token reply limit on thinking); free repairs (indentation, </w:t>
+            </w:r>
+            <w:r>
+              <w:rPr>
+                <w:rFonts w:ascii="Consolas" w:hAnsi="Consolas"/>
+                <w:sz w:val="19"/>
+              </w:rPr>
+              <w:t xml:space="preserve">eq</w:t>
+            </w:r>
+            <w:r>
+              <w:t xml:space="preserve"> bridge, finishing leftover goals); few-shot examples</w:t>
+            </w:r>
+          </w:p>
+        </w:tc>
+        <w:tc>
+          <w:tcPr>
+            <w:tcW w:w="1300" w:type="dxa"/>
+          </w:tcPr>
+          <w:p>
+            <w:pPr>
+              <w:spacing w:after="0"/>
+            </w:pPr>
+            <w:r>
+              <w:t xml:space="preserve">742</w:t>
+            </w:r>
+          </w:p>
+        </w:tc>
+        <w:tc>
+          <w:tcPr>
+            <w:tcW w:w="1200" w:type="dxa"/>
+          </w:tcPr>
+          <w:p>
+            <w:pPr>
+              <w:spacing w:after="0"/>
+            </w:pPr>
+            <w:r>
+              <w:t xml:space="preserve">+77</w:t>
+            </w:r>
+          </w:p>
+        </w:tc>
+      </w:tr>
+      <w:tr>
+        <w:trPr>
+          <w:cantSplit/>
+        </w:trPr>
+        <w:tc>
+          <w:tcPr>
+            <w:tcW w:w="1200" w:type="dxa"/>
+          </w:tcPr>
+          <w:p>
+            <w:pPr>
+              <w:spacing w:after="0"/>
+            </w:pPr>
+            <w:r>
+              <w:t xml:space="preserve">v6</w:t>
+            </w:r>
+          </w:p>
+        </w:tc>
+        <w:tc>
+          <w:tcPr>
+            <w:tcW w:w="5300" w:type="dxa"/>
+          </w:tcPr>
+          <w:p>
+            <w:pPr>
+              <w:spacing w:after="0"/>
+            </w:pPr>
+            <w:r>
+              <w:t xml:space="preserve">Real feedback: in 49% of failed attempts the model had been shown a misleading indentation error; scripts are normalized before checking</w:t>
+            </w:r>
+          </w:p>
+        </w:tc>
+        <w:tc>
+          <w:tcPr>
+            <w:tcW w:w="1300" w:type="dxa"/>
+          </w:tcPr>
+          <w:p>
+            <w:pPr>
+              <w:spacing w:after="0"/>
+            </w:pPr>
+            <w:r>
+              <w:t xml:space="preserve">755</w:t>
+            </w:r>
+          </w:p>
+        </w:tc>
+        <w:tc>
+          <w:tcPr>
+            <w:tcW w:w="1200" w:type="dxa"/>
+          </w:tcPr>
+          <w:p>
+            <w:pPr>
+              <w:spacing w:after="0"/>
+            </w:pPr>
+            <w:r>
+              <w:t xml:space="preserve">+13</w:t>
+            </w:r>
+          </w:p>
+        </w:tc>
+      </w:tr>
+      <w:tr>
+        <w:trPr>
+          <w:cantSplit/>
+        </w:trPr>
+        <w:tc>
+          <w:tcPr>
+            <w:tcW w:w="1200" w:type="dxa"/>
+          </w:tcPr>
+          <w:p>
+            <w:pPr>
+              <w:spacing w:after="0"/>
+            </w:pPr>
+            <w:r>
+              <w:t xml:space="preserve">v7</w:t>
+            </w:r>
+          </w:p>
+        </w:tc>
+        <w:tc>
+          <w:tcPr>
+            <w:tcW w:w="5300" w:type="dxa"/>
+          </w:tcPr>
+          <w:p>
+            <w:pPr>
+              <w:spacing w:after="0"/>
+            </w:pPr>
+            <w:r>
+              <w:t xml:space="preserve">96 facts per theorem instead of 24</w:t>
+            </w:r>
+          </w:p>
+        </w:tc>
+        <w:tc>
+          <w:tcPr>
+            <w:tcW w:w="1300" w:type="dxa"/>
+          </w:tcPr>
+          <w:p>
+            <w:pPr>
+              <w:spacing w:after="0"/>
+            </w:pPr>
+            <w:r>
+              <w:t xml:space="preserve">832</w:t>
+            </w:r>
+          </w:p>
+        </w:tc>
+        <w:tc>
+          <w:tcPr>
+            <w:tcW w:w="1200" w:type="dxa"/>
+          </w:tcPr>
+          <w:p>
+            <w:pPr>
+              <w:spacing w:after="0"/>
+            </w:pPr>
+            <w:r>
+              <w:t xml:space="preserve">+77</w:t>
+            </w:r>
+          </w:p>
+        </w:tc>
+      </w:tr>
+      <w:tr>
+        <w:trPr>
+          <w:cantSplit/>
+        </w:trPr>
+        <w:tc>
+          <w:tcPr>
+            <w:tcW w:w="1200" w:type="dxa"/>
+          </w:tcPr>
+          <w:p>
+            <w:pPr>
+              <w:spacing w:after="0"/>
+            </w:pPr>
+            <w:r>
+              <w:t xml:space="preserve">v8</w:t>
+            </w:r>
+          </w:p>
+        </w:tc>
+        <w:tc>
+          <w:tcPr>
+            <w:tcW w:w="5300" w:type="dxa"/>
+          </w:tcPr>
+          <w:p>
+            <w:pPr>
+              <w:spacing w:after="0"/>
+            </w:pPr>
+            <w:r>
+              <w:t xml:space="preserve">160 facts, 7 rounds</w:t>
+            </w:r>
+          </w:p>
+        </w:tc>
+        <w:tc>
+          <w:tcPr>
+            <w:tcW w:w="1300" w:type="dxa"/>
+          </w:tcPr>
+          <w:p>
+            <w:pPr>
+              <w:spacing w:after="0"/>
+            </w:pPr>
+            <w:r>
+              <w:t xml:space="preserve">859</w:t>
+            </w:r>
+          </w:p>
+        </w:tc>
+        <w:tc>
+          <w:tcPr>
+            <w:tcW w:w="1200" w:type="dxa"/>
+          </w:tcPr>
+          <w:p>
+            <w:pPr>
+              <w:spacing w:after="0"/>
+            </w:pPr>
+            <w:r>
+              <w:t xml:space="preserve">+27</w:t>
+            </w:r>
+          </w:p>
+        </w:tc>
+      </w:tr>
+      <w:tr>
+        <w:trPr>
+          <w:cantSplit/>
+        </w:trPr>
+        <w:tc>
+          <w:tcPr>
+            <w:tcW w:w="1200" w:type="dxa"/>
+          </w:tcPr>
+          <w:p>
+            <w:pPr>
+              <w:spacing w:after="0"/>
+            </w:pPr>
+            <w:r>
+              <w:rPr>
+                <w:b/>
+              </w:rPr>
+              <w:t xml:space="preserve">v9</w:t>
+            </w:r>
+          </w:p>
+        </w:tc>
+        <w:tc>
+          <w:tcPr>
+            <w:tcW w:w="5300" w:type="dxa"/>
+          </w:tcPr>
+          <w:p>
+            <w:pPr>
+              <w:spacing w:after="0"/>
+            </w:pPr>
+            <w:r>
+              <w:t xml:space="preserve">Lemmas shown as Lean prints them; a misapplied lemma is answered with its signature</w:t>
+            </w:r>
+          </w:p>
+        </w:tc>
+        <w:tc>
+          <w:tcPr>
+            <w:tcW w:w="1300" w:type="dxa"/>
+          </w:tcPr>
+          <w:p>
+            <w:pPr>
+              <w:spacing w:after="0"/>
+            </w:pPr>
+            <w:r>
+              <w:rPr>
+                <w:b/>
+              </w:rPr>
+              <w:t xml:space="preserve">877</w:t>
+            </w:r>
+          </w:p>
+        </w:tc>
+        <w:tc>
+          <w:tcPr>
+            <w:tcW w:w="1200" w:type="dxa"/>
+          </w:tcPr>
+          <w:p>
+            <w:pPr>
+              <w:spacing w:after="0"/>
+            </w:pPr>
+            <w:r>
+              <w:t xml:space="preserve">+18</w:t>
+            </w:r>
+          </w:p>
+        </w:tc>
+      </w:tr>
+    </w:tbl>
+    <w:p/>
+    <w:p>
+      <w:r>
+        <w:rPr>
+          <w:b/>
+        </w:rPr>
+        <w:t xml:space="preserve">Missing lemmas, not reasoning.</w:t>
+      </w:r>
+      <w:r>
+        <w:t xml:space="preserve"> On the 257 hardest theorems the human proofs cite a median of 13 earlier lemmas. Search's top 24 facts contained all of them for only 7 theorems; the top 96 for 66 (recall 0.45 at 24, 0.79 at 96, 0.87 at 160). Raising the facts shown from 24 to 96 added 77 proofs in one run, many in the first rounds, including theorems that hours of decomposition had failed on.</w:t>
+      </w:r>
+    </w:p>
+    <w:p>
+      <w:r>
+        <w:rPr>
+          <w:b/>
+        </w:rPr>
+        <w:t xml:space="preserve">What did not help.</w:t>
+      </w:r>
+      <w:r>
+        <w:t xml:space="preserve"> Showing the model Vampire's whole proof (34 / 51 with it, 34 / 51 without, same facts); planning a proof as an outline whose steps are proved as separate lemmas (most steps proved, a hard core step stayed open: 0 / 3 theorems); embedding-based fact retrieval (recall 0.48 at 96 facts against Search's 0.79); and other models on the hardest theorems: gpt-oss-120b, gemma-4-31b, minimax-m3, asi1 and qwen3.8 proved none of the goals tried, including goals deepseek-v4-flash proves.</w:t>
+      </w:r>
+    </w:p>
+    <w:p>
+      <w:r>
+        <w:rPr>
+          <w:b/>
+        </w:rPr>
+        <w:t xml:space="preserve">Cost and stopping.</w:t>
+      </w:r>
+      <w:r>
+        <w:t xml:space="preserve"> The LLM work used about 11,800 calls (162 M input and 59 M output tokens). New proofs cost about 26 calls each in v7 and about 74 in v9, as the remaining theorems grow harder; Phase 1 stops at 877, with 122 theorems unproved, mostly long surreal-number and integer-arithmetic proofs.</w:t>
+      </w:r>
+    </w:p>
+    <w:p>
+      <w:pPr>
         <w:pStyle w:val="Heading1"/>
       </w:pPr>
       <w:r>
@@ -2976,7 +3853,7 @@
         </w:numPr>
       </w:pPr>
       <w:r>
-        <w:t xml:space="preserve">Run-to-run variation on borderline goals (Vampire's time limit): 8 v2 successes were not reproduced in v3.</w:t>
+        <w:t xml:space="preserve">Run-to-run variation on borderline goals (Vampire's time limit, LLM sampling): for example, 5 v3 successes were not reproduced in v4.</w:t>
       </w:r>
     </w:p>
     <w:p>
@@ -2998,7 +3875,7 @@
         </w:numPr>
       </w:pPr>
       <w:r>
-        <w:t xml:space="preserve">LLM results come from a small budget and are estimates.</w:t>
+        <w:t xml:space="preserve">The LLM results depend on one model (deepseek-v4-flash) on one gateway, whose response time was the main bottleneck.</w:t>
       </w:r>
     </w:p>
     <w:p>
@@ -3028,7 +3905,7 @@
         </w:numPr>
       </w:pPr>
       <w:r>
-        <w:t xml:space="preserve">Phase 1 remainder: the 115 goals with a Vampire proof Lean still cannot rebuild, mostly needing higher-order instances: replay Vampire's instantiations from its proof, or give them to the LLM as a hint; richer induction (generalising the goal, strengthening the predicate).</w:t>
+        <w:t xml:space="preserve">Phase 1 is closed at 877 / 999.</w:t>
       </w:r>
     </w:p>
     <w:p>
@@ -3039,7 +3916,7 @@
         </w:numPr>
       </w:pPr>
       <w:r>
-        <w:t xml:space="preserve">Speed: a persistent Lean server, stopping at the first success, and parallel candidates per goal.</w:t>
+        <w:t xml:space="preserve">Phase 2: Hyperon drives Lean. A MeTTa inference controller decides each proof step (automation, a lemma to apply, an LLM suggestion, a split) and Lean checks it; the library and the proved theorems move into a Math Atomspace, so lemmas are retrieved from memory rather than re-proved. Step-by-step Lean is feasible: through the Lean REPL the library loads in 0.2 s and each step takes under 0.01 s.</w:t>
       </w:r>
     </w:p>
     <w:p>
@@ -3050,17 +3927,6 @@
         </w:numPr>
       </w:pPr>
       <w:r>
-        <w:t xml:space="preserve">Phase 2: inference controller (LLM + Hyperon) and the Math Atomspace; proved lemmas enter long-term memory, so they are retrieved rather than re-proved, and research papers feed long-term memory.</w:t>
-      </w:r>
-    </w:p>
-    <w:p>
-      <w:pPr>
-        <w:numPr>
-          <w:ilvl w:val="0"/>
-          <w:numId w:val="4"/>
-        </w:numPr>
-      </w:pPr>
-      <w:r>
         <w:t xml:space="preserve">Phase 3: PLN feeding the inference controller.</w:t>
       </w:r>
     </w:p>
@@ -3093,7 +3959,7 @@
         <w:pStyle w:val="Code"/>
       </w:pPr>
       <w:r>
-        <w:t xml:space="preserve">python3 experiment.py 1 6 ../results/phase1_full_v3.jsonl   # full run</w:t>
+        <w:t xml:space="preserve">python3 experiment.py 1 6 ../results/phase1_full_v4.jsonl   # full run, no LLM</w:t>
       </w:r>
     </w:p>
     <w:p>
@@ -3101,7 +3967,47 @@
         <w:pStyle w:val="Code"/>
       </w:pPr>
       <w:r>
-        <w:t xml:space="preserve">python3 recheck_full.py ../results/phase1_full_v3.jsonl 6 ../results/recheck_v3.jsonl</w:t>
+        <w:t xml:space="preserve">python3 recheck_full.py ../results/phase1_full_v4.jsonl 6 ../results/recheck_v4.jsonl</w:t>
+      </w:r>
+    </w:p>
+    <w:p>
+      <w:pPr>
+        <w:pStyle w:val="Code"/>
+      </w:pPr>
+      <w:r>
+        <w:t xml:space="preserve"># LLM loop over every theorem still unproved, then re-verification</w:t>
+      </w:r>
+    </w:p>
+    <w:p>
+      <w:pPr>
+        <w:pStyle w:val="Code"/>
+      </w:pPr>
+      <w:r>
+        <w:t xml:space="preserve">PYTHONPATH=. python3 experiments/try_llm_vampire_sweep.py prep-search ../results/rest.jsonl --facts 160</w:t>
+      </w:r>
+    </w:p>
+    <w:p>
+      <w:pPr>
+        <w:pStyle w:val="Code"/>
+      </w:pPr>
+      <w:r>
+        <w:t xml:space="preserve">PYTHONPATH=. python3 experiments/try_llm_vampire_sweep.py run ../results/rest.jsonl ../results/out.jsonl noproof \</w:t>
+      </w:r>
+    </w:p>
+    <w:p>
+      <w:pPr>
+        <w:pStyle w:val="Code"/>
+      </w:pPr>
+      <w:r>
+        <w:t xml:space="preserve">    --rounds 7 --workers 4 --examples 3 --model deepseek/deepseek-v4-flash-0731</w:t>
+      </w:r>
+    </w:p>
+    <w:p>
+      <w:pPr>
+        <w:pStyle w:val="Code"/>
+      </w:pPr>
+      <w:r>
+        <w:t xml:space="preserve">PYTHONPATH=. python3 experiments/verify_vp_final.py ../results/verified.json ../results/out.jsonl</w:t>
       </w:r>
     </w:p>
     <w:p/>

</xml_diff>